<commit_message>
chore: refine CV structure
</commit_message>
<xml_diff>
--- a/CV_Java_Denisenko_Dmitry.docx
+++ b/CV_Java_Denisenko_Dmitry.docx
@@ -29,8 +29,8 @@
       </w:r>
       <w:r>
         <w:rPr>
-          <w:sz w:val="36"/>
-          <w:szCs w:val="36"/>
+          <w:sz w:val="40"/>
+          <w:szCs w:val="40"/>
         </w:rPr>
         <w:t>– Platform Engineer</w:t>
       </w:r>
@@ -44,25 +44,23 @@
         </w:rPr>
       </w:pPr>
       <w:r>
-        <w:t>Java, ReactJS, De</w:t>
-      </w:r>
-      <w:r>
-        <w:t>v</w:t>
-      </w:r>
-      <w:r>
-        <w:t xml:space="preserve">Ops, Kubernetes, </w:t>
+        <w:t>Java, ReactJS, Kubernetes</w:t>
+      </w:r>
+      <w:r>
+        <w:t>, AI</w:t>
+      </w:r>
+      <w:r>
+        <w:t xml:space="preserve"> Adoption</w:t>
+      </w:r>
+      <w:r>
+        <w:t xml:space="preserve"> | DevOps</w:t>
+      </w:r>
+      <w:r>
+        <w:t xml:space="preserve">, </w:t>
       </w:r>
       <w:r>
         <w:t>Cloud</w:t>
       </w:r>
-    </w:p>
-    <w:p>
-      <w:pPr>
-        <w:rPr>
-          <w:b/>
-          <w:bCs/>
-        </w:rPr>
-      </w:pPr>
     </w:p>
     <w:p>
       <w:r>
@@ -168,6 +166,8 @@
         <w:pStyle w:val="Heading1"/>
         <w:rPr>
           <w:rFonts w:ascii="Calibri Light" w:hAnsi="Calibri Light" w:cs="Calibri Light"/>
+          <w:b/>
+          <w:bCs/>
           <w:color w:val="2E74B5"/>
           <w:sz w:val="36"/>
           <w:szCs w:val="36"/>
@@ -176,6 +176,8 @@
       <w:r>
         <w:rPr>
           <w:rFonts w:ascii="Calibri Light" w:hAnsi="Calibri Light" w:cs="Calibri Light"/>
+          <w:b/>
+          <w:bCs/>
           <w:color w:val="2E74B5"/>
           <w:sz w:val="36"/>
           <w:szCs w:val="36"/>
@@ -195,49 +197,93 @@
           <w:rFonts w:ascii="Calibri" w:hAnsi="Calibri" w:cs="Calibri"/>
           <w:color w:val="000000"/>
         </w:rPr>
-        <w:t xml:space="preserve">Platform Engineer with 15+ years in IT, </w:t>
-      </w:r>
-      <w:r>
-        <w:rPr>
-          <w:rFonts w:ascii="Calibri" w:hAnsi="Calibri" w:cs="Calibri"/>
-          <w:color w:val="000000"/>
-        </w:rPr>
-        <w:t>specializing</w:t>
-      </w:r>
-      <w:r>
-        <w:rPr>
-          <w:rFonts w:ascii="Calibri" w:hAnsi="Calibri" w:cs="Calibri"/>
-          <w:color w:val="000000"/>
-        </w:rPr>
-        <w:t xml:space="preserve"> in</w:t>
-      </w:r>
-      <w:r>
-        <w:rPr>
-          <w:rFonts w:ascii="Calibri" w:hAnsi="Calibri" w:cs="Calibri"/>
-          <w:color w:val="000000"/>
-        </w:rPr>
-        <w:t xml:space="preserve"> full</w:t>
-      </w:r>
-      <w:r>
-        <w:rPr>
-          <w:rFonts w:ascii="Calibri" w:hAnsi="Calibri" w:cs="Calibri"/>
-          <w:color w:val="000000"/>
-        </w:rPr>
-        <w:t>-</w:t>
-      </w:r>
-      <w:r>
-        <w:rPr>
-          <w:rFonts w:ascii="Calibri" w:hAnsi="Calibri" w:cs="Calibri"/>
-          <w:color w:val="000000"/>
-        </w:rPr>
-        <w:t>stack,</w:t>
-      </w:r>
-      <w:r>
-        <w:rPr>
-          <w:rFonts w:ascii="Calibri" w:hAnsi="Calibri" w:cs="Calibri"/>
-          <w:color w:val="000000"/>
-        </w:rPr>
-        <w:t xml:space="preserve"> distributed systems and event-driven microservices for finance, e-commerce, and travel sectors.</w:t>
+        <w:t>Platform Engineer with 15+ years across full</w:t>
+      </w:r>
+      <w:r>
+        <w:rPr>
+          <w:rFonts w:ascii="Calibri" w:hAnsi="Calibri" w:cs="Calibri"/>
+          <w:color w:val="000000"/>
+        </w:rPr>
+        <w:noBreakHyphen/>
+        <w:t>stack development, distributed systems, DevOps, and event</w:t>
+      </w:r>
+      <w:r>
+        <w:rPr>
+          <w:rFonts w:ascii="Calibri" w:hAnsi="Calibri" w:cs="Calibri"/>
+          <w:color w:val="000000"/>
+        </w:rPr>
+        <w:noBreakHyphen/>
+        <w:t>driven microservices in e</w:t>
+      </w:r>
+      <w:r>
+        <w:rPr>
+          <w:rFonts w:ascii="Calibri" w:hAnsi="Calibri" w:cs="Calibri"/>
+          <w:color w:val="000000"/>
+        </w:rPr>
+        <w:t>C</w:t>
+      </w:r>
+      <w:r>
+        <w:rPr>
+          <w:rFonts w:ascii="Calibri" w:hAnsi="Calibri" w:cs="Calibri"/>
+          <w:color w:val="000000"/>
+        </w:rPr>
+        <w:t>ommerce,</w:t>
+      </w:r>
+      <w:r>
+        <w:rPr>
+          <w:rFonts w:ascii="Calibri" w:hAnsi="Calibri" w:cs="Calibri"/>
+          <w:color w:val="000000"/>
+        </w:rPr>
+        <w:t xml:space="preserve"> edtech,</w:t>
+      </w:r>
+      <w:r>
+        <w:rPr>
+          <w:rFonts w:ascii="Calibri" w:hAnsi="Calibri" w:cs="Calibri"/>
+          <w:color w:val="000000"/>
+        </w:rPr>
+        <w:t xml:space="preserve"> finance,</w:t>
+      </w:r>
+      <w:r>
+        <w:rPr>
+          <w:rFonts w:ascii="Calibri" w:hAnsi="Calibri" w:cs="Calibri"/>
+          <w:color w:val="000000"/>
+        </w:rPr>
+        <w:t xml:space="preserve"> and travel. Recent focus on Java 17+, Spring Boot 3, and React 19, backed by 10+ years of PHP and experience leading teams and delivering </w:t>
+      </w:r>
+      <w:r>
+        <w:rPr>
+          <w:rFonts w:ascii="Calibri" w:hAnsi="Calibri" w:cs="Calibri"/>
+          <w:color w:val="000000"/>
+        </w:rPr>
+        <w:t>web services</w:t>
+      </w:r>
+      <w:r>
+        <w:rPr>
+          <w:rFonts w:ascii="Calibri" w:hAnsi="Calibri" w:cs="Calibri"/>
+          <w:color w:val="000000"/>
+        </w:rPr>
+        <w:t xml:space="preserve"> from startup to enterprise scale</w:t>
+      </w:r>
+      <w:r>
+        <w:rPr>
+          <w:rFonts w:ascii="Calibri" w:hAnsi="Calibri" w:cs="Calibri"/>
+          <w:color w:val="000000"/>
+        </w:rPr>
+        <w:t>.</w:t>
+      </w:r>
+      <w:r>
+        <w:rPr>
+          <w:rFonts w:ascii="Calibri" w:hAnsi="Calibri" w:cs="Calibri"/>
+          <w:color w:val="000000"/>
+        </w:rPr>
+        <w:t xml:space="preserve"> </w:t>
+      </w:r>
+      <w:r>
+        <w:rPr>
+          <w:rFonts w:ascii="Calibri" w:hAnsi="Calibri" w:cs="Calibri"/>
+          <w:color w:val="000000"/>
+        </w:rPr>
+        <w:t>Passionate about open source and an active GitHub contributor.</w:t>
       </w:r>
     </w:p>
     <w:p>
@@ -868,6 +914,35 @@
           <w:color w:val="000000"/>
         </w:rPr>
       </w:pPr>
+      <w:r>
+        <w:rPr>
+          <w:rFonts w:ascii="Calibri" w:hAnsi="Calibri" w:cs="Calibri"/>
+          <w:color w:val="000000"/>
+        </w:rPr>
+        <w:t xml:space="preserve">Magento </w:t>
+      </w:r>
+      <w:r>
+        <w:rPr>
+          <w:rFonts w:ascii="Calibri" w:hAnsi="Calibri" w:cs="Calibri"/>
+          <w:color w:val="000000"/>
+          <w:lang w:val="uk-UA"/>
+        </w:rPr>
+        <w:t>-</w:t>
+      </w:r>
+      <w:r>
+        <w:rPr>
+          <w:rFonts w:ascii="Calibri" w:hAnsi="Calibri" w:cs="Calibri"/>
+          <w:color w:val="000000"/>
+        </w:rPr>
+        <w:t xml:space="preserve"> Software Developer (2009-2011)</w:t>
+      </w:r>
+      <w:r>
+        <w:rPr>
+          <w:rFonts w:ascii="Calibri" w:hAnsi="Calibri" w:cs="Calibri"/>
+          <w:color w:val="000000"/>
+        </w:rPr>
+        <w:t xml:space="preserve"> </w:t>
+      </w:r>
       <w:proofErr w:type="spellStart"/>
       <w:r>
         <w:rPr>
@@ -897,84 +972,36 @@
           <w:rFonts w:ascii="Calibri" w:hAnsi="Calibri" w:cs="Calibri"/>
           <w:color w:val="000000"/>
         </w:rPr>
-        <w:t xml:space="preserve"> Tech Lead/</w:t>
-      </w:r>
-      <w:r>
-        <w:rPr>
-          <w:rFonts w:ascii="Calibri" w:hAnsi="Calibri" w:cs="Calibri"/>
-          <w:color w:val="000000"/>
-        </w:rPr>
-        <w:t>F</w:t>
-      </w:r>
-      <w:r>
-        <w:rPr>
-          <w:rFonts w:ascii="Calibri" w:hAnsi="Calibri" w:cs="Calibri"/>
-          <w:color w:val="000000"/>
-        </w:rPr>
-        <w:t>ounder (2012</w:t>
-      </w:r>
-      <w:r>
-        <w:rPr>
-          <w:rFonts w:ascii="Calibri" w:hAnsi="Calibri" w:cs="Calibri"/>
-          <w:color w:val="000000"/>
-        </w:rPr>
-        <w:t>-</w:t>
-      </w:r>
-      <w:r>
-        <w:rPr>
-          <w:rFonts w:ascii="Calibri" w:hAnsi="Calibri" w:cs="Calibri"/>
-          <w:color w:val="000000"/>
-        </w:rPr>
-        <w:t>2016)</w:t>
-      </w:r>
-    </w:p>
-    <w:p>
-      <w:pPr>
-        <w:pStyle w:val="ListParagraph"/>
-        <w:numPr>
-          <w:ilvl w:val="0"/>
-          <w:numId w:val="12"/>
-        </w:numPr>
-        <w:rPr>
-          <w:rFonts w:ascii="Calibri" w:hAnsi="Calibri" w:cs="Calibri"/>
-          <w:color w:val="000000"/>
-        </w:rPr>
-      </w:pPr>
-      <w:r>
-        <w:rPr>
-          <w:rFonts w:ascii="Calibri" w:hAnsi="Calibri" w:cs="Calibri"/>
-          <w:color w:val="000000"/>
-        </w:rPr>
-        <w:t xml:space="preserve">Magento </w:t>
-      </w:r>
-      <w:r>
-        <w:rPr>
-          <w:rFonts w:ascii="Calibri" w:hAnsi="Calibri" w:cs="Calibri"/>
-          <w:color w:val="000000"/>
-          <w:lang w:val="uk-UA"/>
-        </w:rPr>
-        <w:t>-</w:t>
-      </w:r>
-      <w:r>
-        <w:rPr>
-          <w:rFonts w:ascii="Calibri" w:hAnsi="Calibri" w:cs="Calibri"/>
-          <w:color w:val="000000"/>
-        </w:rPr>
-        <w:t xml:space="preserve"> Software Developer (2009</w:t>
-      </w:r>
-      <w:r>
-        <w:rPr>
-          <w:rFonts w:ascii="Calibri" w:hAnsi="Calibri" w:cs="Calibri"/>
-          <w:color w:val="000000"/>
-        </w:rPr>
-        <w:t>-</w:t>
-      </w:r>
-      <w:r>
-        <w:rPr>
-          <w:rFonts w:ascii="Calibri" w:hAnsi="Calibri" w:cs="Calibri"/>
-          <w:color w:val="000000"/>
-        </w:rPr>
-        <w:t>2011)</w:t>
+        <w:t xml:space="preserve"> Tech Lead/Founder (2012-2016)</w:t>
+      </w:r>
+    </w:p>
+    <w:p>
+      <w:pPr>
+        <w:pStyle w:val="Heading1"/>
+        <w:rPr>
+          <w:b/>
+          <w:bCs/>
+          <w:sz w:val="36"/>
+          <w:szCs w:val="36"/>
+        </w:rPr>
+      </w:pPr>
+      <w:r>
+        <w:rPr>
+          <w:b/>
+          <w:bCs/>
+          <w:sz w:val="36"/>
+          <w:szCs w:val="36"/>
+        </w:rPr>
+        <w:t xml:space="preserve">Recent </w:t>
+      </w:r>
+      <w:r>
+        <w:rPr>
+          <w:b/>
+          <w:bCs/>
+          <w:sz w:val="36"/>
+          <w:szCs w:val="36"/>
+        </w:rPr>
+        <w:t>Projects</w:t>
       </w:r>
     </w:p>
     <w:p>
@@ -985,26 +1012,6 @@
           <w:color w:val="1F4D78"/>
         </w:rPr>
       </w:pPr>
-      <w:r>
-        <w:rPr>
-          <w:sz w:val="36"/>
-          <w:szCs w:val="36"/>
-        </w:rPr>
-        <w:t xml:space="preserve">Recent </w:t>
-      </w:r>
-      <w:r>
-        <w:rPr>
-          <w:sz w:val="36"/>
-          <w:szCs w:val="36"/>
-        </w:rPr>
-        <w:t>Projects</w:t>
-      </w:r>
-      <w:r>
-        <w:rPr>
-          <w:lang w:val="uk-UA"/>
-        </w:rPr>
-        <w:br/>
-      </w:r>
       <w:r>
         <w:rPr>
           <w:rFonts w:ascii="Calibri Light" w:hAnsi="Calibri Light" w:cs="Calibri Light"/>
@@ -1014,6 +1021,35 @@
         </w:rPr>
         <w:t>Founder &amp; Lead at IQ Key Value Platform</w:t>
       </w:r>
+      <w:r>
+        <w:rPr>
+          <w:rFonts w:ascii="Calibri Light" w:hAnsi="Calibri Light" w:cs="Calibri Light"/>
+          <w:color w:val="1F4D78"/>
+          <w:sz w:val="28"/>
+          <w:szCs w:val="28"/>
+        </w:rPr>
+        <w:t xml:space="preserve"> (</w:t>
+      </w:r>
+      <w:hyperlink r:id="rId9" w:history="1">
+        <w:r>
+          <w:rPr>
+            <w:rStyle w:val="Hyperlink"/>
+            <w:rFonts w:ascii="Calibri Light" w:hAnsi="Calibri Light" w:cs="Calibri Light"/>
+            <w:sz w:val="28"/>
+            <w:szCs w:val="28"/>
+          </w:rPr>
+          <w:t>iqkv.com</w:t>
+        </w:r>
+      </w:hyperlink>
+      <w:r>
+        <w:rPr>
+          <w:rFonts w:ascii="Calibri Light" w:hAnsi="Calibri Light" w:cs="Calibri Light"/>
+          <w:color w:val="1F4D78"/>
+          <w:sz w:val="28"/>
+          <w:szCs w:val="28"/>
+        </w:rPr>
+        <w:t>)</w:t>
+      </w:r>
     </w:p>
     <w:p>
       <w:pPr>
@@ -1028,7 +1064,21 @@
           <w:rFonts w:ascii="Calibri" w:hAnsi="Calibri" w:cs="Calibri"/>
           <w:color w:val="000000"/>
         </w:rPr>
-        <w:t xml:space="preserve">Built an open-source SaaS microservices platform featuring a unified stack (Spring Boot, React, </w:t>
+        <w:t>Built a</w:t>
+      </w:r>
+      <w:r>
+        <w:rPr>
+          <w:rFonts w:ascii="Calibri" w:hAnsi="Calibri" w:cs="Calibri"/>
+          <w:color w:val="000000"/>
+        </w:rPr>
+        <w:t>n</w:t>
+      </w:r>
+      <w:r>
+        <w:rPr>
+          <w:rFonts w:ascii="Calibri" w:hAnsi="Calibri" w:cs="Calibri"/>
+          <w:color w:val="000000"/>
+        </w:rPr>
+        <w:t xml:space="preserve"> open-source SaaS microservices platform featuring a unified stack (Spring Boot, React, </w:t>
       </w:r>
       <w:proofErr w:type="spellStart"/>
       <w:r>
@@ -1076,8 +1126,7 @@
       </w:pPr>
       <w:r>
         <w:rPr>
-          <w:rFonts w:ascii="Calibri" w:hAnsi="Calibri" w:cs="Calibri"/>
-          <w:color w:val="000000"/>
+          <w:rStyle w:val="Emphasis"/>
         </w:rPr>
         <w:t>Client: Major European asset manager</w:t>
       </w:r>
@@ -1257,14 +1306,12 @@
     <w:p>
       <w:pPr>
         <w:rPr>
-          <w:rFonts w:ascii="Calibri" w:hAnsi="Calibri" w:cs="Calibri"/>
-          <w:color w:val="000000"/>
-        </w:rPr>
-      </w:pPr>
-      <w:r>
-        <w:rPr>
-          <w:rFonts w:ascii="Calibri" w:hAnsi="Calibri" w:cs="Calibri"/>
-          <w:color w:val="000000"/>
+          <w:rStyle w:val="Emphasis"/>
+        </w:rPr>
+      </w:pPr>
+      <w:r>
+        <w:rPr>
+          <w:rStyle w:val="Emphasis"/>
         </w:rPr>
         <w:t>Client: Home improvement &amp; gardening retailer</w:t>
       </w:r>
@@ -1273,58 +1320,72 @@
       <w:pPr>
         <w:rPr>
           <w:rFonts w:ascii="Calibri" w:hAnsi="Calibri" w:cs="Calibri"/>
+          <w:color w:val="000000"/>
+        </w:rPr>
+      </w:pPr>
+      <w:r>
+        <w:rPr>
+          <w:rFonts w:ascii="Calibri" w:hAnsi="Calibri" w:cs="Calibri"/>
           <w:b/>
           <w:color w:val="000000"/>
         </w:rPr>
-      </w:pPr>
+        <w:t>Overview:</w:t>
+      </w:r>
       <w:r>
         <w:rPr>
           <w:rFonts w:ascii="Calibri" w:hAnsi="Calibri" w:cs="Calibri"/>
           <w:b/>
           <w:color w:val="000000"/>
         </w:rPr>
-        <w:t>Overview:</w:t>
-      </w:r>
-    </w:p>
-    <w:p>
-      <w:pPr>
-        <w:rPr>
-          <w:rFonts w:ascii="Calibri" w:hAnsi="Calibri" w:cs="Calibri"/>
-          <w:color w:val="000000"/>
-        </w:rPr>
-      </w:pPr>
-      <w:r>
-        <w:rPr>
-          <w:rFonts w:ascii="Calibri" w:hAnsi="Calibri" w:cs="Calibri"/>
-          <w:color w:val="000000"/>
-        </w:rPr>
-        <w:t>Developed an enterprise PIM system with microservices (Kafka, REST APIs), Angular UI, event sourcing, and distributed transactions on multi-cloud platforms.</w:t>
-      </w:r>
-    </w:p>
-    <w:p>
-      <w:pPr>
+        <w:t xml:space="preserve"> </w:t>
+      </w:r>
+      <w:r>
+        <w:rPr>
+          <w:rFonts w:ascii="Calibri" w:hAnsi="Calibri" w:cs="Calibri"/>
+          <w:color w:val="000000"/>
+        </w:rPr>
+        <w:t xml:space="preserve">Developed an enterprise PIM system with microservices (Kafka, REST APIs), Angular UI, event sourcing, and </w:t>
+      </w:r>
+      <w:proofErr w:type="gramStart"/>
+      <w:r>
+        <w:rPr>
+          <w:rFonts w:ascii="Calibri" w:hAnsi="Calibri" w:cs="Calibri"/>
+          <w:color w:val="000000"/>
+        </w:rPr>
+        <w:t>distributed</w:t>
+      </w:r>
+      <w:proofErr w:type="gramEnd"/>
+      <w:r>
+        <w:rPr>
+          <w:rFonts w:ascii="Calibri" w:hAnsi="Calibri" w:cs="Calibri"/>
+          <w:color w:val="000000"/>
+        </w:rPr>
+        <w:t xml:space="preserve"> transactions on multi-cloud platforms.</w:t>
+      </w:r>
+    </w:p>
+    <w:p>
+      <w:pPr>
+        <w:rPr>
+          <w:rFonts w:ascii="Calibri" w:hAnsi="Calibri" w:cs="Calibri"/>
+          <w:color w:val="000000"/>
+        </w:rPr>
+      </w:pPr>
+      <w:r>
         <w:rPr>
           <w:rFonts w:ascii="Calibri" w:hAnsi="Calibri" w:cs="Calibri"/>
           <w:b/>
           <w:color w:val="000000"/>
         </w:rPr>
-      </w:pPr>
+        <w:t>Technologies:</w:t>
+      </w:r>
       <w:r>
         <w:rPr>
           <w:rFonts w:ascii="Calibri" w:hAnsi="Calibri" w:cs="Calibri"/>
           <w:b/>
           <w:color w:val="000000"/>
         </w:rPr>
-        <w:t>Technologies:</w:t>
-      </w:r>
-    </w:p>
-    <w:p>
-      <w:pPr>
-        <w:rPr>
-          <w:rFonts w:ascii="Calibri" w:hAnsi="Calibri" w:cs="Calibri"/>
-          <w:color w:val="000000"/>
-        </w:rPr>
-      </w:pPr>
+        <w:t xml:space="preserve"> </w:t>
+      </w:r>
       <w:r>
         <w:rPr>
           <w:rFonts w:ascii="Calibri" w:hAnsi="Calibri" w:cs="Calibri"/>
@@ -1385,27 +1446,25 @@
       <w:pPr>
         <w:rPr>
           <w:rFonts w:ascii="Calibri" w:hAnsi="Calibri" w:cs="Calibri"/>
+          <w:color w:val="000000"/>
+        </w:rPr>
+      </w:pPr>
+      <w:r>
+        <w:rPr>
+          <w:rFonts w:ascii="Calibri" w:hAnsi="Calibri" w:cs="Calibri"/>
           <w:b/>
           <w:color w:val="000000"/>
         </w:rPr>
-      </w:pPr>
+        <w:t>Responsibilities:</w:t>
+      </w:r>
       <w:r>
         <w:rPr>
           <w:rFonts w:ascii="Calibri" w:hAnsi="Calibri" w:cs="Calibri"/>
           <w:b/>
           <w:color w:val="000000"/>
         </w:rPr>
-        <w:t>Responsibilities:</w:t>
-      </w:r>
-    </w:p>
-    <w:p>
-      <w:pPr>
-        <w:rPr>
-          <w:rFonts w:ascii="Calibri Light" w:hAnsi="Calibri Light" w:cs="Calibri Light"/>
-          <w:color w:val="2E74B5"/>
-          <w:lang w:val="uk-UA"/>
-        </w:rPr>
-      </w:pPr>
+        <w:t xml:space="preserve"> </w:t>
+      </w:r>
       <w:r>
         <w:rPr>
           <w:rFonts w:ascii="Calibri" w:hAnsi="Calibri" w:cs="Calibri"/>
@@ -1417,7 +1476,6 @@
         <w:rPr>
           <w:rFonts w:ascii="Calibri" w:hAnsi="Calibri" w:cs="Calibri"/>
           <w:color w:val="000000"/>
-          <w:lang w:val="uk-UA"/>
         </w:rPr>
         <w:br/>
       </w:r>
@@ -1445,14 +1503,12 @@
     <w:p>
       <w:pPr>
         <w:rPr>
-          <w:rFonts w:ascii="Calibri" w:hAnsi="Calibri" w:cs="Calibri"/>
-          <w:color w:val="000000"/>
-        </w:rPr>
-      </w:pPr>
-      <w:r>
-        <w:rPr>
-          <w:rFonts w:ascii="Calibri" w:hAnsi="Calibri" w:cs="Calibri"/>
-          <w:color w:val="000000"/>
+          <w:rStyle w:val="Emphasis"/>
+        </w:rPr>
+      </w:pPr>
+      <w:r>
+        <w:rPr>
+          <w:rStyle w:val="Emphasis"/>
         </w:rPr>
         <w:t>Client: Global IT Solutions Provider (Travel Industry)</w:t>
       </w:r>
@@ -1461,26 +1517,25 @@
       <w:pPr>
         <w:rPr>
           <w:rFonts w:ascii="Calibri" w:hAnsi="Calibri" w:cs="Calibri"/>
+          <w:color w:val="000000"/>
+        </w:rPr>
+      </w:pPr>
+      <w:r>
+        <w:rPr>
+          <w:rFonts w:ascii="Calibri" w:hAnsi="Calibri" w:cs="Calibri"/>
           <w:b/>
           <w:color w:val="000000"/>
         </w:rPr>
-      </w:pPr>
+        <w:t>Overview:</w:t>
+      </w:r>
       <w:r>
         <w:rPr>
           <w:rFonts w:ascii="Calibri" w:hAnsi="Calibri" w:cs="Calibri"/>
           <w:b/>
           <w:color w:val="000000"/>
         </w:rPr>
-        <w:t>Overview:</w:t>
-      </w:r>
-    </w:p>
-    <w:p>
-      <w:pPr>
-        <w:rPr>
-          <w:rFonts w:ascii="Calibri" w:hAnsi="Calibri" w:cs="Calibri"/>
-          <w:color w:val="000000"/>
-        </w:rPr>
-      </w:pPr>
+        <w:t xml:space="preserve"> </w:t>
+      </w:r>
       <w:r>
         <w:rPr>
           <w:rFonts w:ascii="Calibri" w:hAnsi="Calibri" w:cs="Calibri"/>
@@ -1669,14 +1724,12 @@
     <w:p>
       <w:pPr>
         <w:rPr>
-          <w:rFonts w:ascii="Calibri" w:hAnsi="Calibri" w:cs="Calibri"/>
-          <w:color w:val="000000"/>
-        </w:rPr>
-      </w:pPr>
-      <w:r>
-        <w:rPr>
-          <w:rFonts w:ascii="Calibri" w:hAnsi="Calibri" w:cs="Calibri"/>
-          <w:color w:val="000000"/>
+          <w:rStyle w:val="Emphasis"/>
+        </w:rPr>
+      </w:pPr>
+      <w:r>
+        <w:rPr>
+          <w:rStyle w:val="Emphasis"/>
         </w:rPr>
         <w:t>Client: Global travel IT provider</w:t>
       </w:r>
@@ -1685,26 +1738,25 @@
       <w:pPr>
         <w:rPr>
           <w:rFonts w:ascii="Calibri" w:hAnsi="Calibri" w:cs="Calibri"/>
+          <w:color w:val="000000"/>
+        </w:rPr>
+      </w:pPr>
+      <w:r>
+        <w:rPr>
+          <w:rFonts w:ascii="Calibri" w:hAnsi="Calibri" w:cs="Calibri"/>
           <w:b/>
           <w:color w:val="000000"/>
         </w:rPr>
-      </w:pPr>
+        <w:t>Overview:</w:t>
+      </w:r>
       <w:r>
         <w:rPr>
           <w:rFonts w:ascii="Calibri" w:hAnsi="Calibri" w:cs="Calibri"/>
           <w:b/>
           <w:color w:val="000000"/>
         </w:rPr>
-        <w:t>Overview:</w:t>
-      </w:r>
-    </w:p>
-    <w:p>
-      <w:pPr>
-        <w:rPr>
-          <w:rFonts w:ascii="Calibri" w:hAnsi="Calibri" w:cs="Calibri"/>
-          <w:color w:val="000000"/>
-        </w:rPr>
-      </w:pPr>
+        <w:t xml:space="preserve"> </w:t>
+      </w:r>
       <w:r>
         <w:rPr>
           <w:rFonts w:ascii="Calibri" w:hAnsi="Calibri" w:cs="Calibri"/>
@@ -1889,6 +1941,131 @@
           <w:color w:val="000000"/>
         </w:rPr>
         <w:t>Managed Agile processes for a 20+ member team</w:t>
+      </w:r>
+    </w:p>
+    <w:p>
+      <w:pPr>
+        <w:pStyle w:val="ListParagraph"/>
+        <w:rPr>
+          <w:rFonts w:ascii="Calibri" w:hAnsi="Calibri" w:cs="Calibri"/>
+          <w:color w:val="000000"/>
+        </w:rPr>
+      </w:pPr>
+    </w:p>
+    <w:p>
+      <w:pPr>
+        <w:pStyle w:val="Heading2"/>
+        <w:rPr>
+          <w:b/>
+          <w:bCs/>
+          <w:sz w:val="28"/>
+          <w:szCs w:val="28"/>
+        </w:rPr>
+      </w:pPr>
+      <w:r>
+        <w:rPr>
+          <w:b/>
+          <w:bCs/>
+          <w:sz w:val="32"/>
+          <w:szCs w:val="32"/>
+        </w:rPr>
+        <w:t>Education</w:t>
+      </w:r>
+    </w:p>
+    <w:p>
+      <w:pPr>
+        <w:pStyle w:val="Heading2"/>
+        <w:rPr>
+          <w:rFonts w:ascii="Calibri" w:eastAsiaTheme="minorHAnsi" w:hAnsi="Calibri" w:cs="Calibri"/>
+          <w:color w:val="000000"/>
+          <w:sz w:val="22"/>
+          <w:szCs w:val="22"/>
+        </w:rPr>
+      </w:pPr>
+      <w:r>
+        <w:rPr>
+          <w:rFonts w:ascii="Calibri" w:eastAsiaTheme="minorHAnsi" w:hAnsi="Calibri" w:cs="Calibri"/>
+          <w:color w:val="000000"/>
+          <w:sz w:val="22"/>
+          <w:szCs w:val="22"/>
+        </w:rPr>
+        <w:t>Bachelor</w:t>
+      </w:r>
+      <w:r>
+        <w:rPr>
+          <w:rFonts w:ascii="Calibri" w:eastAsiaTheme="minorHAnsi" w:hAnsi="Calibri" w:cs="Calibri"/>
+          <w:color w:val="000000"/>
+          <w:sz w:val="22"/>
+          <w:szCs w:val="22"/>
+        </w:rPr>
+        <w:t>’</w:t>
+      </w:r>
+      <w:r>
+        <w:rPr>
+          <w:rFonts w:ascii="Calibri" w:eastAsiaTheme="minorHAnsi" w:hAnsi="Calibri" w:cs="Calibri"/>
+          <w:color w:val="000000"/>
+          <w:sz w:val="22"/>
+          <w:szCs w:val="22"/>
+        </w:rPr>
+        <w:t>s degree, Math, Software engineering</w:t>
+      </w:r>
+    </w:p>
+    <w:p>
+      <w:pPr>
+        <w:pStyle w:val="Caption"/>
+        <w:rPr>
+          <w:sz w:val="22"/>
+          <w:szCs w:val="22"/>
+        </w:rPr>
+      </w:pPr>
+      <w:r>
+        <w:rPr>
+          <w:sz w:val="22"/>
+          <w:szCs w:val="22"/>
+        </w:rPr>
+        <w:t xml:space="preserve">Donetsk National </w:t>
+      </w:r>
+      <w:r>
+        <w:rPr>
+          <w:sz w:val="22"/>
+          <w:szCs w:val="22"/>
+        </w:rPr>
+        <w:t>University</w:t>
+      </w:r>
+      <w:r>
+        <w:rPr>
+          <w:sz w:val="22"/>
+          <w:szCs w:val="22"/>
+        </w:rPr>
+        <w:t>, Donetsk</w:t>
+      </w:r>
+      <w:r>
+        <w:rPr>
+          <w:sz w:val="22"/>
+          <w:szCs w:val="22"/>
+        </w:rPr>
+        <w:br/>
+      </w:r>
+      <w:r>
+        <w:rPr>
+          <w:sz w:val="22"/>
+          <w:szCs w:val="22"/>
+        </w:rPr>
+        <w:t>September 2002</w:t>
+      </w:r>
+      <w:r>
+        <w:rPr>
+          <w:sz w:val="22"/>
+          <w:szCs w:val="22"/>
+        </w:rPr>
+        <w:t xml:space="preserve"> - </w:t>
+      </w:r>
+      <w:r>
+        <w:rPr>
+          <w:sz w:val="22"/>
+          <w:szCs w:val="22"/>
+        </w:rPr>
+        <w:t>July 2006</w:t>
       </w:r>
     </w:p>
     <w:sectPr>

</xml_diff>

<commit_message>
chore: make cv up-to-date
</commit_message>
<xml_diff>
--- a/CV_Java_Denisenko_Dmitry.docx
+++ b/CV_Java_Denisenko_Dmitry.docx
@@ -44,22 +44,19 @@
         </w:rPr>
       </w:pPr>
       <w:r>
-        <w:t>Java, ReactJS, Kubernetes</w:t>
-      </w:r>
-      <w:r>
-        <w:t>, AI</w:t>
-      </w:r>
-      <w:r>
-        <w:t xml:space="preserve"> Adoption</w:t>
-      </w:r>
-      <w:r>
-        <w:t xml:space="preserve"> | DevOps</w:t>
-      </w:r>
-      <w:r>
-        <w:t xml:space="preserve">, </w:t>
-      </w:r>
-      <w:r>
-        <w:t>Cloud</w:t>
+        <w:t>Java Developer | Backend | UI | JavaScript, React</w:t>
+      </w:r>
+      <w:r>
+        <w:t>JS</w:t>
+      </w:r>
+      <w:r>
+        <w:t>, DevOps, K8s,</w:t>
+      </w:r>
+      <w:r>
+        <w:t xml:space="preserve"> Cloud,</w:t>
+      </w:r>
+      <w:r>
+        <w:t xml:space="preserve"> AI</w:t>
       </w:r>
     </w:p>
     <w:p>
@@ -197,7 +194,49 @@
           <w:rFonts w:ascii="Calibri" w:hAnsi="Calibri" w:cs="Calibri"/>
           <w:color w:val="000000"/>
         </w:rPr>
-        <w:t>Platform Engineer with 15+ years across full</w:t>
+        <w:t>Platform Engineer with 15+ years working on backend systems, distributed architectures, and DevOps workflows across eCommerce, edtech, finance, and travel. Primary focus on modern Java (17–21), Spring Boot 3/4, service design, and integration patterns, with earlier experience in PHP and</w:t>
+      </w:r>
+      <w:r>
+        <w:rPr>
+          <w:rFonts w:ascii="Calibri" w:hAnsi="Calibri" w:cs="Calibri"/>
+          <w:color w:val="000000"/>
+        </w:rPr>
+        <w:t xml:space="preserve"> </w:t>
+      </w:r>
+      <w:r>
+        <w:rPr>
+          <w:rFonts w:ascii="Calibri" w:hAnsi="Calibri" w:cs="Calibri"/>
+          <w:color w:val="000000"/>
+        </w:rPr>
+        <w:t>practical exposure to React</w:t>
+      </w:r>
+      <w:r>
+        <w:rPr>
+          <w:rFonts w:ascii="Calibri" w:hAnsi="Calibri" w:cs="Calibri"/>
+          <w:color w:val="000000"/>
+        </w:rPr>
+        <w:t>JS, frontend patterns for a few UI frameworks</w:t>
+      </w:r>
+      <w:r>
+        <w:rPr>
+          <w:rFonts w:ascii="Calibri" w:hAnsi="Calibri" w:cs="Calibri"/>
+          <w:color w:val="000000"/>
+        </w:rPr>
+        <w:t>.</w:t>
+      </w:r>
+      <w:r>
+        <w:rPr>
+          <w:rFonts w:ascii="Calibri" w:hAnsi="Calibri" w:cs="Calibri"/>
+          <w:color w:val="000000"/>
+        </w:rPr>
+        <w:t xml:space="preserve"> </w:t>
+      </w:r>
+      <w:r>
+        <w:rPr>
+          <w:rFonts w:ascii="Calibri" w:hAnsi="Calibri" w:cs="Calibri"/>
+          <w:color w:val="000000"/>
+        </w:rPr>
+        <w:t>Background includes designing and evolving platforms from early</w:t>
       </w:r>
       <w:r>
         <w:rPr>
@@ -205,7 +244,37 @@
           <w:color w:val="000000"/>
         </w:rPr>
         <w:noBreakHyphen/>
-        <w:t>stack development, distributed systems, DevOps, and event</w:t>
+        <w:t xml:space="preserve">stage products to enterprise </w:t>
+      </w:r>
+      <w:proofErr w:type="gramStart"/>
+      <w:r>
+        <w:rPr>
+          <w:rFonts w:ascii="Calibri" w:hAnsi="Calibri" w:cs="Calibri"/>
+          <w:color w:val="000000"/>
+        </w:rPr>
+        <w:t>systems</w:t>
+      </w:r>
+      <w:r>
+        <w:rPr>
+          <w:rFonts w:ascii="Calibri" w:hAnsi="Calibri" w:cs="Calibri"/>
+          <w:color w:val="000000"/>
+        </w:rPr>
+        <w:t>,</w:t>
+      </w:r>
+      <w:r>
+        <w:rPr>
+          <w:rFonts w:ascii="Calibri" w:hAnsi="Calibri" w:cs="Calibri"/>
+          <w:color w:val="000000"/>
+        </w:rPr>
+        <w:t xml:space="preserve"> and</w:t>
+      </w:r>
+      <w:proofErr w:type="gramEnd"/>
+      <w:r>
+        <w:rPr>
+          <w:rFonts w:ascii="Calibri" w:hAnsi="Calibri" w:cs="Calibri"/>
+          <w:color w:val="000000"/>
+        </w:rPr>
+        <w:t xml:space="preserve"> providing technical guidance to engineering teams. Active open</w:t>
       </w:r>
       <w:r>
         <w:rPr>
@@ -213,77 +282,7 @@
           <w:color w:val="000000"/>
         </w:rPr>
         <w:noBreakHyphen/>
-        <w:t>driven microservices in e</w:t>
-      </w:r>
-      <w:r>
-        <w:rPr>
-          <w:rFonts w:ascii="Calibri" w:hAnsi="Calibri" w:cs="Calibri"/>
-          <w:color w:val="000000"/>
-        </w:rPr>
-        <w:t>C</w:t>
-      </w:r>
-      <w:r>
-        <w:rPr>
-          <w:rFonts w:ascii="Calibri" w:hAnsi="Calibri" w:cs="Calibri"/>
-          <w:color w:val="000000"/>
-        </w:rPr>
-        <w:t>ommerce,</w:t>
-      </w:r>
-      <w:r>
-        <w:rPr>
-          <w:rFonts w:ascii="Calibri" w:hAnsi="Calibri" w:cs="Calibri"/>
-          <w:color w:val="000000"/>
-        </w:rPr>
-        <w:t xml:space="preserve"> edtech,</w:t>
-      </w:r>
-      <w:r>
-        <w:rPr>
-          <w:rFonts w:ascii="Calibri" w:hAnsi="Calibri" w:cs="Calibri"/>
-          <w:color w:val="000000"/>
-        </w:rPr>
-        <w:t xml:space="preserve"> finance,</w:t>
-      </w:r>
-      <w:r>
-        <w:rPr>
-          <w:rFonts w:ascii="Calibri" w:hAnsi="Calibri" w:cs="Calibri"/>
-          <w:color w:val="000000"/>
-        </w:rPr>
-        <w:t xml:space="preserve"> and travel. Recent focus on Java 17+, Spring Boot 3, and React 19, backed by 10+ years of PHP and experience leading teams and delivering </w:t>
-      </w:r>
-      <w:r>
-        <w:rPr>
-          <w:rFonts w:ascii="Calibri" w:hAnsi="Calibri" w:cs="Calibri"/>
-          <w:color w:val="000000"/>
-        </w:rPr>
-        <w:t>web services</w:t>
-      </w:r>
-      <w:r>
-        <w:rPr>
-          <w:rFonts w:ascii="Calibri" w:hAnsi="Calibri" w:cs="Calibri"/>
-          <w:color w:val="000000"/>
-        </w:rPr>
-        <w:t xml:space="preserve"> from startup to enterprise scale</w:t>
-      </w:r>
-      <w:r>
-        <w:rPr>
-          <w:rFonts w:ascii="Calibri" w:hAnsi="Calibri" w:cs="Calibri"/>
-          <w:color w:val="000000"/>
-        </w:rPr>
-        <w:t>.</w:t>
-      </w:r>
-      <w:r>
-        <w:rPr>
-          <w:rFonts w:ascii="Calibri" w:hAnsi="Calibri" w:cs="Calibri"/>
-          <w:color w:val="000000"/>
-        </w:rPr>
-        <w:t xml:space="preserve"> </w:t>
-      </w:r>
-      <w:r>
-        <w:rPr>
-          <w:rFonts w:ascii="Calibri" w:hAnsi="Calibri" w:cs="Calibri"/>
-          <w:color w:val="000000"/>
-        </w:rPr>
-        <w:t>Passionate about open source and an active GitHub contributor.</w:t>
+        <w:t>source contributor with an emphasis on reliability, maintainability, and developer experience.</w:t>
       </w:r>
     </w:p>
     <w:p>
@@ -328,14 +327,35 @@
           <w:rFonts w:ascii="Calibri" w:hAnsi="Calibri" w:cs="Calibri"/>
           <w:color w:val="000000"/>
         </w:rPr>
-        <w:t xml:space="preserve"> Delivers full-stack SaaS platforms with Java (17/21) and Spring Boot 3, React</w:t>
-      </w:r>
-      <w:r>
-        <w:rPr>
-          <w:rFonts w:ascii="Calibri" w:hAnsi="Calibri" w:cs="Calibri"/>
-          <w:color w:val="000000"/>
-        </w:rPr>
-        <w:t>JS 18</w:t>
+        <w:t xml:space="preserve"> Delivers full-stack SaaS platforms with Java (17/21) and Spring Boot 3</w:t>
+      </w:r>
+      <w:r>
+        <w:rPr>
+          <w:rFonts w:ascii="Calibri" w:hAnsi="Calibri" w:cs="Calibri"/>
+          <w:color w:val="000000"/>
+        </w:rPr>
+        <w:t>-4</w:t>
+      </w:r>
+      <w:r>
+        <w:rPr>
+          <w:rFonts w:ascii="Calibri" w:hAnsi="Calibri" w:cs="Calibri"/>
+          <w:color w:val="000000"/>
+        </w:rPr>
+        <w:t>, React</w:t>
+      </w:r>
+      <w:r>
+        <w:rPr>
+          <w:rFonts w:ascii="Calibri" w:hAnsi="Calibri" w:cs="Calibri"/>
+          <w:color w:val="000000"/>
+        </w:rPr>
+        <w:t>JS 1</w:t>
+      </w:r>
+      <w:r>
+        <w:rPr>
+          <w:rFonts w:ascii="Calibri" w:hAnsi="Calibri" w:cs="Calibri"/>
+          <w:color w:val="000000"/>
+        </w:rPr>
+        <w:t>9</w:t>
       </w:r>
       <w:r>
         <w:rPr>
@@ -412,7 +432,21 @@
           <w:rFonts w:ascii="Calibri" w:hAnsi="Calibri" w:cs="Calibri"/>
           <w:color w:val="000000"/>
         </w:rPr>
-        <w:t xml:space="preserve"> Proficient in Kubernetes/OpenShift; led 20+ enterprise migrations and boosted CI/CD efficiency by 60%.</w:t>
+        <w:t xml:space="preserve"> Proficient in Kubernetes/OpenShift; led 20+ enterprise migrations and boosted CI/CD efficiency by </w:t>
+      </w:r>
+      <w:r>
+        <w:rPr>
+          <w:rFonts w:ascii="Calibri" w:hAnsi="Calibri" w:cs="Calibri"/>
+          <w:color w:val="000000"/>
+        </w:rPr>
+        <w:t>25</w:t>
+      </w:r>
+      <w:r>
+        <w:rPr>
+          <w:rFonts w:ascii="Calibri" w:hAnsi="Calibri" w:cs="Calibri"/>
+          <w:color w:val="000000"/>
+        </w:rPr>
+        <w:t>%.</w:t>
       </w:r>
     </w:p>
     <w:p>
@@ -520,7 +554,35 @@
           <w:rFonts w:ascii="Calibri" w:hAnsi="Calibri" w:cs="Calibri"/>
           <w:color w:val="000000"/>
         </w:rPr>
-        <w:t>, Apache Camel, Jackson, Laravel, Symfony, Doctrine ORM</w:t>
+        <w:t>, Apache Camel, Jackson, Laravel</w:t>
+      </w:r>
+      <w:r>
+        <w:rPr>
+          <w:rFonts w:ascii="Calibri" w:hAnsi="Calibri" w:cs="Calibri"/>
+          <w:color w:val="000000"/>
+        </w:rPr>
+        <w:t xml:space="preserve"> 9+</w:t>
+      </w:r>
+      <w:r>
+        <w:rPr>
+          <w:rFonts w:ascii="Calibri" w:hAnsi="Calibri" w:cs="Calibri"/>
+          <w:color w:val="000000"/>
+        </w:rPr>
+        <w:t>, Symfony</w:t>
+      </w:r>
+      <w:r>
+        <w:rPr>
+          <w:rFonts w:ascii="Calibri" w:hAnsi="Calibri" w:cs="Calibri"/>
+          <w:color w:val="000000"/>
+        </w:rPr>
+        <w:t xml:space="preserve"> 7+</w:t>
+      </w:r>
+      <w:r>
+        <w:rPr>
+          <w:rFonts w:ascii="Calibri" w:hAnsi="Calibri" w:cs="Calibri"/>
+          <w:color w:val="000000"/>
+        </w:rPr>
+        <w:t>, Doctrine ORM</w:t>
       </w:r>
       <w:r>
         <w:rPr>
@@ -1163,6 +1225,7 @@
           <w:rFonts w:ascii="Calibri" w:hAnsi="Calibri" w:cs="Calibri"/>
           <w:color w:val="000000"/>
         </w:rPr>
+        <w:lastRenderedPageBreak/>
         <w:t>Built microservices with Apache Camel, Kafka Streams, Hibernate, Java, and PL/SQL.</w:t>
       </w:r>
     </w:p>
@@ -1203,7 +1266,6 @@
           <w:rFonts w:ascii="Calibri" w:hAnsi="Calibri" w:cs="Calibri"/>
           <w:color w:val="000000"/>
         </w:rPr>
-        <w:lastRenderedPageBreak/>
         <w:t>Developed a custom business rules system and ETL engine.</w:t>
       </w:r>
     </w:p>

</xml_diff>

<commit_message>
chore: update CV formatting
</commit_message>
<xml_diff>
--- a/CV_Java_Denisenko_Dmitry.docx
+++ b/CV_Java_Denisenko_Dmitry.docx
@@ -5,7 +5,6 @@
     <w:p>
       <w:pPr>
         <w:pStyle w:val="Title"/>
-        <w:ind w:left="720" w:hanging="720"/>
         <w:rPr>
           <w:sz w:val="44"/>
           <w:szCs w:val="44"/>
@@ -29,10 +28,17 @@
       </w:r>
       <w:r>
         <w:rPr>
-          <w:sz w:val="40"/>
-          <w:szCs w:val="40"/>
+          <w:sz w:val="28"/>
+          <w:szCs w:val="28"/>
         </w:rPr>
         <w:t>– Platform Engineer</w:t>
+      </w:r>
+      <w:r>
+        <w:rPr>
+          <w:sz w:val="28"/>
+          <w:szCs w:val="28"/>
+        </w:rPr>
+        <w:t>, based in Cluj, Romania</w:t>
       </w:r>
     </w:p>
     <w:p>
@@ -41,22 +47,44 @@
         <w:rPr>
           <w:b/>
           <w:bCs/>
-        </w:rPr>
-      </w:pPr>
-      <w:r>
-        <w:t>Java Developer | Backend | UI | JavaScript, React</w:t>
-      </w:r>
-      <w:r>
-        <w:t>JS</w:t>
-      </w:r>
-      <w:r>
-        <w:t>, DevOps, K8s,</w:t>
-      </w:r>
-      <w:r>
-        <w:t xml:space="preserve"> Cloud,</w:t>
-      </w:r>
-      <w:r>
-        <w:t xml:space="preserve"> AI</w:t>
+          <w:sz w:val="20"/>
+          <w:szCs w:val="20"/>
+        </w:rPr>
+      </w:pPr>
+      <w:r>
+        <w:rPr>
+          <w:sz w:val="20"/>
+          <w:szCs w:val="20"/>
+        </w:rPr>
+        <w:t>Full-Stack Developer | Java · Spring Boot · React ·</w:t>
+      </w:r>
+      <w:r>
+        <w:rPr>
+          <w:sz w:val="20"/>
+          <w:szCs w:val="20"/>
+        </w:rPr>
+        <w:t>PHP ·</w:t>
+      </w:r>
+      <w:r>
+        <w:rPr>
+          <w:sz w:val="20"/>
+          <w:szCs w:val="20"/>
+        </w:rPr>
+        <w:t xml:space="preserve"> Laravel |</w:t>
+      </w:r>
+      <w:r>
+        <w:rPr>
+          <w:sz w:val="20"/>
+          <w:szCs w:val="20"/>
+        </w:rPr>
+        <w:t xml:space="preserve">Saas Dev, </w:t>
+      </w:r>
+      <w:r>
+        <w:rPr>
+          <w:sz w:val="20"/>
+          <w:szCs w:val="20"/>
+        </w:rPr>
+        <w:t>Kubernetes, DevOps, AWS</w:t>
       </w:r>
     </w:p>
     <w:p>
@@ -2004,15 +2032,6 @@
         </w:rPr>
         <w:t>Managed Agile processes for a 20+ member team</w:t>
       </w:r>
-    </w:p>
-    <w:p>
-      <w:pPr>
-        <w:pStyle w:val="ListParagraph"/>
-        <w:rPr>
-          <w:rFonts w:ascii="Calibri" w:hAnsi="Calibri" w:cs="Calibri"/>
-          <w:color w:val="000000"/>
-        </w:rPr>
-      </w:pPr>
     </w:p>
     <w:p>
       <w:pPr>

</xml_diff>